<commit_message>
Final review: fix figure-text typos and ion notation, a periderm note, guide wording
- Figure descriptions: 23.1.13 "sporangium (2)" -> (2n), 23.4.41 "fernroot",
  23.5.59 "needless leaves", 24.4.36 "budscale", 25.2.23 "breaking own ATP".
- Ch 25 figure descriptions write ions as the slides do (K+, Ca2+, H+, NO3-,
  Zn, Cu) instead of the screen-reader spelling ("K plus", "C a 2 plus").
- New "Textbook:" note on 24.1.9: periderm is cork plus cork cambium.
- Guides: three sentences that were stronger than their slides reworded
  (no "only the shady-side cells", "every cell", "every plant").
- Study guide: Cooksonia line, hypocotyl answer and key term, 24.1.9 row.
- PRINTED_NOTES.md: keep inserted blank pages when exporting a PDF from
  LibreOffice; the LibreOffice header quirk on chapter first pages.

Co-Authored-By: Claude Opus 5.5 <noreply@anthropic.com>
Claude-Session: https://claude.ai/code/session_01UCsH9gqSSaKQv3czcDCA1B
</commit_message>
<xml_diff>
--- a/Printed Exam Notes/Ch 23 Printed Notes.docx
+++ b/Printed Exam Notes/Ch 23 Printed Notes.docx
@@ -2344,7 +2344,7 @@
       </w:pPr>
       <w:r>
         <w:rPr/>
-        <w:t>One idea runs through the whole chapter: every plant's life cycle has two generations that take turns. The gametophyte is haploid (n) and makes eggs and sperm; the sporophyte is diploid (2n) and makes spores. Over evolution, the sporophyte got bigger and the gametophyte got smaller (23.1.12, 23.1.14, 23.1.15).</w:t>
+        <w:t>One idea runs through the whole chapter: every land plant's life cycle has two generations that take turns. The gametophyte is haploid (n) and makes eggs and sperm; the sporophyte is diploid (2n) and makes spores. Over evolution, the sporophyte got bigger and the gametophyte got smaller (23.1.12, 23.1.14, 23.1.15).</w:t>
       </w:r>
     </w:p>
     <w:p>
@@ -4022,7 +4022,7 @@
       </w:r>
       <w:r>
         <w:rPr/>
-        <w:t>A sporophyte (2N) gives rise to spores through meiosis and a gametophyte (1N) gives rise to gametes that fuse in fertilization to form a zygote. In diploid phase, zygote(2n) on mitosis leads to sporophyte (2n), which further leads to sporangium (2). In haploid phase (n), meiosis leads to spores (n), which on mitosis leads to gametophyte (n). Further, on mitosis, gametes (n) are formed which on fertilization leads to formation of zygote in diploid phase.</w:t>
+        <w:t>A sporophyte (2N) gives rise to spores through meiosis and a gametophyte (1N) gives rise to gametes that fuse in fertilization to form a zygote. In diploid phase, zygote(2n) on mitosis leads to sporophyte (2n), which further leads to sporangium (2n). In haploid phase (n), meiosis leads to spores (n), which on mitosis leads to gametophyte (n). Further, on mitosis, gametes (n) are formed which on fertilization leads to formation of zygote in diploid phase.</w:t>
       </w:r>
     </w:p>
     <w:p>
@@ -6042,7 +6042,7 @@
       </w:r>
       <w:r>
         <w:rPr/>
-        <w:t>Close-up of sporangium (left). Diagram of whisk fernroot plant (right) shows labels for rhizome, root, aerial stem, scale and sporangium.</w:t>
+        <w:t>Close-up of sporangium (left). Diagram of whisk fern plant (right) shows labels for rhizome, root, aerial stem, scale and sporangium.</w:t>
       </w:r>
     </w:p>
     <w:p>
@@ -7096,7 +7096,7 @@
       </w:r>
       <w:r>
         <w:rPr/>
-        <w:t>Examples of conifer include pine having pollen and seed cones (a), spruce (needless leaves), and Juniper (tall shrub, scale-like leaves.</w:t>
+        <w:t>Examples of conifer include pine having pollen and seed cones (a), spruce (needle leaves), and Juniper (tall shrub, scale-like leaves).</w:t>
       </w:r>
     </w:p>
     <w:p>

</xml_diff>